<commit_message>
Programme Management: Replace DRP-001 Disaster Recovery Plan with controlled production version
</commit_message>
<xml_diff>
--- a/tooling/ProgrammeManagement/04 Operations/DRP-001 Disaster Recovery Plan.docx
+++ b/tooling/ProgrammeManagement/04 Operations/DRP-001 Disaster Recovery Plan.docx
@@ -4,941 +4,234 @@
   <w:body>
     <w:p>
       <w:pPr>
-        <w:jc w:val="center"/>
+        <w:pStyle w:val="Heading1"/>
       </w:pPr>
       <w:r>
-        <w:rPr>
-          <w:b/>
-          <w:sz w:val="44"/>
-        </w:rPr>
-        <w:t>DRP-001</w:t>
-        <w:br/>
-        <w:t>Disaster Recovery Plan</w:t>
+        <w:t>DRP-001 Disaster Recovery Plan</w:t>
+      </w:r>
+    </w:p>
+    <w:p>
+      <w:pPr>
+        <w:pStyle w:val="Heading2"/>
+      </w:pPr>
+      <w:r>
+        <w:t>1. Purpose</w:t>
       </w:r>
     </w:p>
     <w:p>
       <w:r>
-        <w:t>Repository: tooling\ProgrammeManagement\04 Operations\\</w:t>
+        <w:rPr>
+          <w:sz w:val="21"/>
+        </w:rPr>
+        <w:t>Define the programme disaster recovery framework for restoring critical services, systems and controlled information following a disaster or catastrophic failure.</w:t>
+      </w:r>
+    </w:p>
+    <w:p>
+      <w:pPr>
+        <w:pStyle w:val="Heading2"/>
+      </w:pPr>
+      <w:r>
+        <w:t>2. Scope</w:t>
       </w:r>
     </w:p>
     <w:p>
       <w:r>
-        <w:t>Filename: DRP-001 Disaster Recovery Plan.docx</w:t>
+        <w:rPr>
+          <w:sz w:val="21"/>
+        </w:rPr>
+        <w:t>Applies to programme technology, repositories, infrastructure, operational services, information assets and supporting capabilities.</w:t>
+      </w:r>
+    </w:p>
+    <w:p>
+      <w:pPr>
+        <w:pStyle w:val="Heading2"/>
+      </w:pPr>
+      <w:r>
+        <w:t>3. Disaster Recovery Objectives</w:t>
       </w:r>
     </w:p>
     <w:p>
       <w:r>
-        <w:br w:type="page"/>
+        <w:rPr>
+          <w:sz w:val="21"/>
+        </w:rPr>
+        <w:t>Restore critical capability, minimise disruption and protect programme information.</w:t>
       </w:r>
     </w:p>
     <w:p>
       <w:pPr>
-        <w:pStyle w:val="Heading1"/>
+        <w:pStyle w:val="Heading2"/>
       </w:pPr>
       <w:r>
-        <w:t>Engineering Control Record</w:t>
-      </w:r>
-    </w:p>
-    <w:tbl>
-      <w:tblPr>
-        <w:tblStyle w:val="TableGrid"/>
-        <w:tblW w:type="auto" w:w="0"/>
-        <w:tblLook w:firstColumn="1" w:firstRow="1" w:lastColumn="0" w:lastRow="0" w:noHBand="0" w:noVBand="1" w:val="04A0"/>
-      </w:tblPr>
-      <w:tblGrid>
-        <w:gridCol w:w="4320"/>
-        <w:gridCol w:w="4320"/>
-      </w:tblGrid>
-      <w:tr>
-        <w:tc>
-          <w:tcPr>
-            <w:tcW w:type="dxa" w:w="4320"/>
-          </w:tcPr>
-          <w:p>
-            <w:r>
-              <w:t>Field</w:t>
-            </w:r>
-          </w:p>
-        </w:tc>
-        <w:tc>
-          <w:tcPr>
-            <w:tcW w:type="dxa" w:w="4320"/>
-          </w:tcPr>
-          <w:p>
-            <w:r>
-              <w:t>Value</w:t>
-            </w:r>
-          </w:p>
-        </w:tc>
-      </w:tr>
-      <w:tr>
-        <w:tc>
-          <w:tcPr>
-            <w:tcW w:type="dxa" w:w="4320"/>
-          </w:tcPr>
-          <w:p>
-            <w:r>
-              <w:t>Document ID</w:t>
-            </w:r>
-          </w:p>
-        </w:tc>
-        <w:tc>
-          <w:tcPr>
-            <w:tcW w:type="dxa" w:w="4320"/>
-          </w:tcPr>
-          <w:p>
-            <w:r>
-              <w:t>DRP-001</w:t>
-            </w:r>
-          </w:p>
-        </w:tc>
-      </w:tr>
-      <w:tr>
-        <w:tc>
-          <w:tcPr>
-            <w:tcW w:type="dxa" w:w="4320"/>
-          </w:tcPr>
-          <w:p>
-            <w:r>
-              <w:t>Title</w:t>
-            </w:r>
-          </w:p>
-        </w:tc>
-        <w:tc>
-          <w:tcPr>
-            <w:tcW w:type="dxa" w:w="4320"/>
-          </w:tcPr>
-          <w:p>
-            <w:r>
-              <w:t>Disaster Recovery Plan</w:t>
-            </w:r>
-          </w:p>
-        </w:tc>
-      </w:tr>
-      <w:tr>
-        <w:tc>
-          <w:tcPr>
-            <w:tcW w:type="dxa" w:w="4320"/>
-          </w:tcPr>
-          <w:p>
-            <w:r>
-              <w:t>Status</w:t>
-            </w:r>
-          </w:p>
-        </w:tc>
-        <w:tc>
-          <w:tcPr>
-            <w:tcW w:type="dxa" w:w="4320"/>
-          </w:tcPr>
-          <w:p>
-            <w:r>
-              <w:t>CONTROLLED</w:t>
-            </w:r>
-          </w:p>
-        </w:tc>
-      </w:tr>
-      <w:tr>
-        <w:tc>
-          <w:tcPr>
-            <w:tcW w:type="dxa" w:w="4320"/>
-          </w:tcPr>
-          <w:p>
-            <w:r>
-              <w:t>Version</w:t>
-            </w:r>
-          </w:p>
-        </w:tc>
-        <w:tc>
-          <w:tcPr>
-            <w:tcW w:type="dxa" w:w="4320"/>
-          </w:tcPr>
-          <w:p>
-            <w:r>
-              <w:t>1.0</w:t>
-            </w:r>
-          </w:p>
-        </w:tc>
-      </w:tr>
-      <w:tr>
-        <w:tc>
-          <w:tcPr>
-            <w:tcW w:type="dxa" w:w="4320"/>
-          </w:tcPr>
-          <w:p>
-            <w:r>
-              <w:t>Owner</w:t>
-            </w:r>
-          </w:p>
-        </w:tc>
-        <w:tc>
-          <w:tcPr>
-            <w:tcW w:type="dxa" w:w="4320"/>
-          </w:tcPr>
-          <w:p>
-            <w:r>
-              <w:t>Programme Office</w:t>
-            </w:r>
-          </w:p>
-        </w:tc>
-      </w:tr>
-      <w:tr>
-        <w:tc>
-          <w:tcPr>
-            <w:tcW w:type="dxa" w:w="4320"/>
-          </w:tcPr>
-          <w:p>
-            <w:r>
-              <w:t>Repository Path</w:t>
-            </w:r>
-          </w:p>
-        </w:tc>
-        <w:tc>
-          <w:tcPr>
-            <w:tcW w:type="dxa" w:w="4320"/>
-          </w:tcPr>
-          <w:p>
-            <w:r>
-              <w:t>tooling\ProgrammeManagement\04 Operations\\</w:t>
-            </w:r>
-          </w:p>
-        </w:tc>
-      </w:tr>
-      <w:tr>
-        <w:tc>
-          <w:tcPr>
-            <w:tcW w:type="dxa" w:w="4320"/>
-          </w:tcPr>
-          <w:p>
-            <w:r>
-              <w:t>Filename</w:t>
-            </w:r>
-          </w:p>
-        </w:tc>
-        <w:tc>
-          <w:tcPr>
-            <w:tcW w:type="dxa" w:w="4320"/>
-          </w:tcPr>
-          <w:p>
-            <w:r>
-              <w:t>DRP-001 Disaster Recovery Plan.docx</w:t>
-            </w:r>
-          </w:p>
-        </w:tc>
-      </w:tr>
-      <w:tr>
-        <w:tc>
-          <w:tcPr>
-            <w:tcW w:type="dxa" w:w="4320"/>
-          </w:tcPr>
-          <w:p>
-            <w:r>
-              <w:t>Baseline</w:t>
-            </w:r>
-          </w:p>
-        </w:tc>
-        <w:tc>
-          <w:tcPr>
-            <w:tcW w:type="dxa" w:w="4320"/>
-          </w:tcPr>
-          <w:p>
-            <w:r>
-              <w:t>FOUNDATION_ENGINEERING_WORKFLOW_v1</w:t>
-            </w:r>
-          </w:p>
-        </w:tc>
-      </w:tr>
-      <w:tr>
-        <w:tc>
-          <w:tcPr>
-            <w:tcW w:type="dxa" w:w="4320"/>
-          </w:tcPr>
-          <w:p>
-            <w:r>
-              <w:t>Last Updated</w:t>
-            </w:r>
-          </w:p>
-        </w:tc>
-        <w:tc>
-          <w:tcPr>
-            <w:tcW w:type="dxa" w:w="4320"/>
-          </w:tcPr>
-          <w:p>
-            <w:r/>
-          </w:p>
-        </w:tc>
-      </w:tr>
-      <w:tr>
-        <w:tc>
-          <w:tcPr>
-            <w:tcW w:type="dxa" w:w="4320"/>
-          </w:tcPr>
-          <w:p>
-            <w:r>
-              <w:t>Next Review</w:t>
-            </w:r>
-          </w:p>
-        </w:tc>
-        <w:tc>
-          <w:tcPr>
-            <w:tcW w:type="dxa" w:w="4320"/>
-          </w:tcPr>
-          <w:p>
-            <w:r/>
-          </w:p>
-        </w:tc>
-      </w:tr>
-    </w:tbl>
-    <w:p>
-      <w:pPr>
-        <w:pStyle w:val="Heading1"/>
-      </w:pPr>
-      <w:r>
-        <w:t>Revision History</w:t>
-      </w:r>
-    </w:p>
-    <w:tbl>
-      <w:tblPr>
-        <w:tblStyle w:val="TableGrid"/>
-        <w:tblW w:type="auto" w:w="0"/>
-        <w:tblLook w:firstColumn="1" w:firstRow="1" w:lastColumn="0" w:lastRow="0" w:noHBand="0" w:noVBand="1" w:val="04A0"/>
-      </w:tblPr>
-      <w:tblGrid>
-        <w:gridCol w:w="1728"/>
-        <w:gridCol w:w="1728"/>
-        <w:gridCol w:w="1728"/>
-        <w:gridCol w:w="1728"/>
-        <w:gridCol w:w="1728"/>
-      </w:tblGrid>
-      <w:tr>
-        <w:tc>
-          <w:tcPr>
-            <w:tcW w:type="dxa" w:w="1728"/>
-          </w:tcPr>
-          <w:p>
-            <w:r>
-              <w:t>Version</w:t>
-            </w:r>
-          </w:p>
-        </w:tc>
-        <w:tc>
-          <w:tcPr>
-            <w:tcW w:type="dxa" w:w="1728"/>
-          </w:tcPr>
-          <w:p>
-            <w:r>
-              <w:t>Date</w:t>
-            </w:r>
-          </w:p>
-        </w:tc>
-        <w:tc>
-          <w:tcPr>
-            <w:tcW w:type="dxa" w:w="1728"/>
-          </w:tcPr>
-          <w:p>
-            <w:r>
-              <w:t>Author</w:t>
-            </w:r>
-          </w:p>
-        </w:tc>
-        <w:tc>
-          <w:tcPr>
-            <w:tcW w:type="dxa" w:w="1728"/>
-          </w:tcPr>
-          <w:p>
-            <w:r>
-              <w:t>Change</w:t>
-            </w:r>
-          </w:p>
-        </w:tc>
-        <w:tc>
-          <w:tcPr>
-            <w:tcW w:type="dxa" w:w="1728"/>
-          </w:tcPr>
-          <w:p>
-            <w:r>
-              <w:t>Status</w:t>
-            </w:r>
-          </w:p>
-        </w:tc>
-      </w:tr>
-      <w:tr>
-        <w:tc>
-          <w:tcPr>
-            <w:tcW w:type="dxa" w:w="1728"/>
-          </w:tcPr>
-          <w:p>
-            <w:r>
-              <w:t>1.0</w:t>
-            </w:r>
-          </w:p>
-        </w:tc>
-        <w:tc>
-          <w:tcPr>
-            <w:tcW w:type="dxa" w:w="1728"/>
-          </w:tcPr>
-          <w:p>
-            <w:r/>
-          </w:p>
-        </w:tc>
-        <w:tc>
-          <w:tcPr>
-            <w:tcW w:type="dxa" w:w="1728"/>
-          </w:tcPr>
-          <w:p>
-            <w:r>
-              <w:t>Programme Office</w:t>
-            </w:r>
-          </w:p>
-        </w:tc>
-        <w:tc>
-          <w:tcPr>
-            <w:tcW w:type="dxa" w:w="1728"/>
-          </w:tcPr>
-          <w:p>
-            <w:r>
-              <w:t>Initial Issue</w:t>
-            </w:r>
-          </w:p>
-        </w:tc>
-        <w:tc>
-          <w:tcPr>
-            <w:tcW w:type="dxa" w:w="1728"/>
-          </w:tcPr>
-          <w:p>
-            <w:r>
-              <w:t>CONTROLLED</w:t>
-            </w:r>
-          </w:p>
-        </w:tc>
-      </w:tr>
-    </w:tbl>
-    <w:p>
-      <w:pPr>
-        <w:pStyle w:val="Heading1"/>
-      </w:pPr>
-      <w:r>
-        <w:t>Table of Contents</w:t>
+        <w:t>4. Recovery Principles</w:t>
       </w:r>
     </w:p>
     <w:p>
       <w:r>
-        <w:t>1. Cover Page</w:t>
+        <w:rPr>
+          <w:sz w:val="21"/>
+        </w:rPr>
+        <w:t>Preparedness, resilience, prioritisation, accountability, traceability, evidence-based recovery and continual improvement.</w:t>
+      </w:r>
+    </w:p>
+    <w:p>
+      <w:pPr>
+        <w:pStyle w:val="Heading2"/>
+      </w:pPr>
+      <w:r>
+        <w:t>5. Recovery Governance</w:t>
       </w:r>
     </w:p>
     <w:p>
       <w:r>
-        <w:t>2. Engineering Control Record</w:t>
+        <w:rPr>
+          <w:sz w:val="21"/>
+        </w:rPr>
+        <w:t>Programme Office oversight for planning, activation, reporting and review.</w:t>
+      </w:r>
+    </w:p>
+    <w:p>
+      <w:pPr>
+        <w:pStyle w:val="Heading2"/>
+      </w:pPr>
+      <w:r>
+        <w:t>6. Recovery Roles and Responsibilities</w:t>
       </w:r>
     </w:p>
     <w:p>
       <w:r>
-        <w:t>3. Revision History</w:t>
+        <w:rPr>
+          <w:sz w:val="21"/>
+        </w:rPr>
+        <w:t>Responsibilities for Programme Office, Recovery Coordinator, Engineering, Operations, Security and Quality.</w:t>
+      </w:r>
+    </w:p>
+    <w:p>
+      <w:pPr>
+        <w:pStyle w:val="Heading2"/>
+      </w:pPr>
+      <w:r>
+        <w:t>7. Disaster Declaration</w:t>
       </w:r>
     </w:p>
     <w:p>
       <w:r>
-        <w:t>4. Table of Contents</w:t>
+        <w:rPr>
+          <w:sz w:val="21"/>
+        </w:rPr>
+        <w:t>Assessment, declaration authority, activation criteria and notification.</w:t>
+      </w:r>
+    </w:p>
+    <w:p>
+      <w:pPr>
+        <w:pStyle w:val="Heading2"/>
+      </w:pPr>
+      <w:r>
+        <w:t>8. Recovery Procedures</w:t>
       </w:r>
     </w:p>
     <w:p>
       <w:r>
-        <w:t>5. Purpose</w:t>
+        <w:rPr>
+          <w:sz w:val="21"/>
+        </w:rPr>
+        <w:t>Activation, restoration, validation, documentation and return to normal operations.</w:t>
+      </w:r>
+    </w:p>
+    <w:p>
+      <w:pPr>
+        <w:pStyle w:val="Heading2"/>
+      </w:pPr>
+      <w:r>
+        <w:t>9. Recovery Priorities</w:t>
       </w:r>
     </w:p>
     <w:p>
       <w:r>
-        <w:t>6. Scope</w:t>
+        <w:rPr>
+          <w:sz w:val="21"/>
+        </w:rPr>
+        <w:t>Restore critical services, repositories, infrastructure and operational capability in approved priority order.</w:t>
+      </w:r>
+    </w:p>
+    <w:p>
+      <w:pPr>
+        <w:pStyle w:val="Heading2"/>
+      </w:pPr>
+      <w:r>
+        <w:t>10. Communication and Escalation</w:t>
       </w:r>
     </w:p>
     <w:p>
       <w:r>
-        <w:t>7. Disaster Recovery Principles</w:t>
+        <w:rPr>
+          <w:sz w:val="21"/>
+        </w:rPr>
+        <w:t>Internal and external communications, governance reporting and escalation.</w:t>
+      </w:r>
+    </w:p>
+    <w:p>
+      <w:pPr>
+        <w:pStyle w:val="Heading2"/>
+      </w:pPr>
+      <w:r>
+        <w:t>11. Recovery Testing</w:t>
       </w:r>
     </w:p>
     <w:p>
       <w:r>
-        <w:t>8. Recovery Roles and Responsibilities</w:t>
+        <w:rPr>
+          <w:sz w:val="21"/>
+        </w:rPr>
+        <w:t>Scheduled recovery exercises, evaluation and improvement.</w:t>
+      </w:r>
+    </w:p>
+    <w:p>
+      <w:pPr>
+        <w:pStyle w:val="Heading2"/>
+      </w:pPr>
+      <w:r>
+        <w:t>12. Plan Maintenance</w:t>
       </w:r>
     </w:p>
     <w:p>
       <w:r>
-        <w:t>9. Recovery Activation Criteria</w:t>
+        <w:rPr>
+          <w:sz w:val="21"/>
+        </w:rPr>
+        <w:t>Controlled review following tests, changes or recovery events.</w:t>
+      </w:r>
+    </w:p>
+    <w:p>
+      <w:pPr>
+        <w:pStyle w:val="Heading2"/>
+      </w:pPr>
+      <w:r>
+        <w:t>13. Related Documents</w:t>
       </w:r>
     </w:p>
     <w:p>
       <w:r>
-        <w:t>10. Recovery Priorities</w:t>
+        <w:rPr>
+          <w:sz w:val="21"/>
+        </w:rPr>
+        <w:t>OPS-001 Operations Manual; BCP-001 Business Continuity Plan; GOV-001 Governance Management Manual; STR-001 Programme Strategy; ENG-001 Engineering Management Manual; Programme Management Foundation; Quality Management System; Security Management System.</w:t>
+      </w:r>
+    </w:p>
+    <w:p>
+      <w:pPr>
+        <w:pStyle w:val="Heading2"/>
+      </w:pPr>
+      <w:r>
+        <w:t>14. Document Control</w:t>
       </w:r>
     </w:p>
     <w:p>
       <w:r>
-        <w:t>11. Recovery Procedures</w:t>
-      </w:r>
-    </w:p>
-    <w:p>
-      <w:r>
-        <w:t>12. Recovery Communications</w:t>
-      </w:r>
-    </w:p>
-    <w:p>
-      <w:r>
-        <w:t>13. Recovery Validation</w:t>
-      </w:r>
-    </w:p>
-    <w:p>
-      <w:r>
-        <w:t>14. Recovery Testing</w:t>
-      </w:r>
-    </w:p>
-    <w:p>
-      <w:r>
-        <w:t>15. Recovery Review</w:t>
-      </w:r>
-    </w:p>
-    <w:p>
-      <w:r>
-        <w:t>16. Related Documents</w:t>
-      </w:r>
-    </w:p>
-    <w:p>
-      <w:r>
-        <w:t>17. Appendices</w:t>
-      </w:r>
-    </w:p>
-    <w:p>
-      <w:pPr>
-        <w:pStyle w:val="Heading1"/>
-      </w:pPr>
-      <w:r>
-        <w:t>Purpose</w:t>
-      </w:r>
-    </w:p>
-    <w:p>
-      <w:r>
-        <w:t>Define the controlled process for recovering the JustDefenders Programme Management System after a disruptive event.</w:t>
-      </w:r>
-    </w:p>
-    <w:p>
-      <w:pPr>
-        <w:pStyle w:val="Heading1"/>
-      </w:pPr>
-      <w:r>
-        <w:t>Scope</w:t>
-      </w:r>
-    </w:p>
-    <w:p>
-      <w:r>
-        <w:t>Applies to engineering repositories, operational systems, cloud services, development environments, production services, documentation, configuration data and supporting infrastructure.</w:t>
-      </w:r>
-    </w:p>
-    <w:p>
-      <w:pPr>
-        <w:pStyle w:val="Heading1"/>
-      </w:pPr>
-      <w:r>
-        <w:t>Disaster Recovery Principles</w:t>
-      </w:r>
-    </w:p>
-    <w:p>
-      <w:pPr>
-        <w:pStyle w:val="ListBullet"/>
-      </w:pPr>
-      <w:r>
-        <w:t>Controlled Recovery</w:t>
-      </w:r>
-    </w:p>
-    <w:p>
-      <w:pPr>
-        <w:pStyle w:val="ListBullet"/>
-      </w:pPr>
-      <w:r>
-        <w:t>Documented Procedures</w:t>
-      </w:r>
-    </w:p>
-    <w:p>
-      <w:pPr>
-        <w:pStyle w:val="ListBullet"/>
-      </w:pPr>
-      <w:r>
-        <w:t>Verified Recovery</w:t>
-      </w:r>
-    </w:p>
-    <w:p>
-      <w:pPr>
-        <w:pStyle w:val="ListBullet"/>
-      </w:pPr>
-      <w:r>
-        <w:t>Recovery Testing</w:t>
-      </w:r>
-    </w:p>
-    <w:p>
-      <w:pPr>
-        <w:pStyle w:val="ListBullet"/>
-      </w:pPr>
-      <w:r>
-        <w:t>Continuous Improvement</w:t>
-      </w:r>
-    </w:p>
-    <w:p>
-      <w:pPr>
-        <w:pStyle w:val="Heading1"/>
-      </w:pPr>
-      <w:r>
-        <w:t>Recovery Roles and Responsibilities</w:t>
-      </w:r>
-    </w:p>
-    <w:tbl>
-      <w:tblPr>
-        <w:tblStyle w:val="TableGrid"/>
-        <w:tblW w:type="auto" w:w="0"/>
-        <w:tblLook w:firstColumn="1" w:firstRow="1" w:lastColumn="0" w:lastRow="0" w:noHBand="0" w:noVBand="1" w:val="04A0"/>
-      </w:tblPr>
-      <w:tblGrid>
-        <w:gridCol w:w="4320"/>
-        <w:gridCol w:w="4320"/>
-      </w:tblGrid>
-      <w:tr>
-        <w:tc>
-          <w:tcPr>
-            <w:tcW w:type="dxa" w:w="4320"/>
-          </w:tcPr>
-          <w:p>
-            <w:r>
-              <w:t>Role</w:t>
-            </w:r>
-          </w:p>
-        </w:tc>
-        <w:tc>
-          <w:tcPr>
-            <w:tcW w:type="dxa" w:w="4320"/>
-          </w:tcPr>
-          <w:p>
-            <w:r>
-              <w:t>Responsibility</w:t>
-            </w:r>
-          </w:p>
-        </w:tc>
-      </w:tr>
-      <w:tr>
-        <w:tc>
-          <w:tcPr>
-            <w:tcW w:type="dxa" w:w="4320"/>
-          </w:tcPr>
-          <w:p>
-            <w:r>
-              <w:t>Programme Office</w:t>
-            </w:r>
-          </w:p>
-        </w:tc>
-        <w:tc>
-          <w:tcPr>
-            <w:tcW w:type="dxa" w:w="4320"/>
-          </w:tcPr>
-          <w:p>
-            <w:r>
-              <w:t>Govern recovery governance and coordination.</w:t>
-            </w:r>
-          </w:p>
-        </w:tc>
-      </w:tr>
-      <w:tr>
-        <w:tc>
-          <w:tcPr>
-            <w:tcW w:type="dxa" w:w="4320"/>
-          </w:tcPr>
-          <w:p>
-            <w:r>
-              <w:t>Engineering Operations</w:t>
-            </w:r>
-          </w:p>
-        </w:tc>
-        <w:tc>
-          <w:tcPr>
-            <w:tcW w:type="dxa" w:w="4320"/>
-          </w:tcPr>
-          <w:p>
-            <w:r>
-              <w:t>Recover engineering systems and repositories.</w:t>
-            </w:r>
-          </w:p>
-        </w:tc>
-      </w:tr>
-      <w:tr>
-        <w:tc>
-          <w:tcPr>
-            <w:tcW w:type="dxa" w:w="4320"/>
-          </w:tcPr>
-          <w:p>
-            <w:r>
-              <w:t>Platform Operations</w:t>
-            </w:r>
-          </w:p>
-        </w:tc>
-        <w:tc>
-          <w:tcPr>
-            <w:tcW w:type="dxa" w:w="4320"/>
-          </w:tcPr>
-          <w:p>
-            <w:r>
-              <w:t>Restore platform services and infrastructure.</w:t>
-            </w:r>
-          </w:p>
-        </w:tc>
-      </w:tr>
-      <w:tr>
-        <w:tc>
-          <w:tcPr>
-            <w:tcW w:type="dxa" w:w="4320"/>
-          </w:tcPr>
-          <w:p>
-            <w:r>
-              <w:t>Security</w:t>
-            </w:r>
-          </w:p>
-        </w:tc>
-        <w:tc>
-          <w:tcPr>
-            <w:tcW w:type="dxa" w:w="4320"/>
-          </w:tcPr>
-          <w:p>
-            <w:r>
-              <w:t>Oversee security response and validation.</w:t>
-            </w:r>
-          </w:p>
-        </w:tc>
-      </w:tr>
-      <w:tr>
-        <w:tc>
-          <w:tcPr>
-            <w:tcW w:type="dxa" w:w="4320"/>
-          </w:tcPr>
-          <w:p>
-            <w:r>
-              <w:t>Recovery Coordinator</w:t>
-            </w:r>
-          </w:p>
-        </w:tc>
-        <w:tc>
-          <w:tcPr>
-            <w:tcW w:type="dxa" w:w="4320"/>
-          </w:tcPr>
-          <w:p>
-            <w:r>
-              <w:t>Coordinate recovery execution and reporting.</w:t>
-            </w:r>
-          </w:p>
-        </w:tc>
-      </w:tr>
-    </w:tbl>
-    <w:p>
-      <w:pPr>
-        <w:pStyle w:val="Heading1"/>
-      </w:pPr>
-      <w:r>
-        <w:t>Recovery Activation Criteria</w:t>
-      </w:r>
-    </w:p>
-    <w:p>
-      <w:r>
-        <w:t>Activate the Disaster Recovery Plan following major incidents that materially affect engineering systems, infrastructure, cloud platforms, repositories, operational services or critical business functions.</w:t>
-      </w:r>
-    </w:p>
-    <w:p>
-      <w:pPr>
-        <w:pStyle w:val="Heading1"/>
-      </w:pPr>
-      <w:r>
-        <w:t>Recovery Priorities</w:t>
-      </w:r>
-    </w:p>
-    <w:p>
-      <w:pPr>
-        <w:pStyle w:val="ListBullet"/>
-      </w:pPr>
-      <w:r>
-        <w:t>Personnel</w:t>
-      </w:r>
-    </w:p>
-    <w:p>
-      <w:pPr>
-        <w:pStyle w:val="ListBullet"/>
-      </w:pPr>
-      <w:r>
-        <w:t>Governance</w:t>
-      </w:r>
-    </w:p>
-    <w:p>
-      <w:pPr>
-        <w:pStyle w:val="ListBullet"/>
-      </w:pPr>
-      <w:r>
-        <w:t>Engineering Assets</w:t>
-      </w:r>
-    </w:p>
-    <w:p>
-      <w:pPr>
-        <w:pStyle w:val="ListBullet"/>
-      </w:pPr>
-      <w:r>
-        <w:t>Infrastructure</w:t>
-      </w:r>
-    </w:p>
-    <w:p>
-      <w:pPr>
-        <w:pStyle w:val="ListBullet"/>
-      </w:pPr>
-      <w:r>
-        <w:t>Platforms</w:t>
-      </w:r>
-    </w:p>
-    <w:p>
-      <w:pPr>
-        <w:pStyle w:val="ListBullet"/>
-      </w:pPr>
-      <w:r>
-        <w:t>Data</w:t>
-      </w:r>
-    </w:p>
-    <w:p>
-      <w:pPr>
-        <w:pStyle w:val="ListBullet"/>
-      </w:pPr>
-      <w:r>
-        <w:t>External Services</w:t>
-      </w:r>
-    </w:p>
-    <w:p>
-      <w:pPr>
-        <w:pStyle w:val="Heading1"/>
-      </w:pPr>
-      <w:r>
-        <w:t>Recovery Procedures</w:t>
-      </w:r>
-    </w:p>
-    <w:p>
-      <w:r>
-        <w:t>Declare the incident, activate the recovery plan, assess impact, restore prioritised services, verify recovery outcomes, record actions taken, and formally return to normal operations.</w:t>
-      </w:r>
-    </w:p>
-    <w:p>
-      <w:pPr>
-        <w:pStyle w:val="Heading1"/>
-      </w:pPr>
-      <w:r>
-        <w:t>Recovery Communications</w:t>
-      </w:r>
-    </w:p>
-    <w:p>
-      <w:r>
-        <w:t>Maintain timely internal and external communications throughout recovery, including status reporting, escalation and stakeholder updates.</w:t>
-      </w:r>
-    </w:p>
-    <w:p>
-      <w:pPr>
-        <w:pStyle w:val="Heading1"/>
-      </w:pPr>
-      <w:r>
-        <w:t>Recovery Validation</w:t>
-      </w:r>
-    </w:p>
-    <w:p>
-      <w:r>
-        <w:t>Verify recovered services, record validation evidence, confirm operational readiness and update controlled records.</w:t>
-      </w:r>
-    </w:p>
-    <w:p>
-      <w:pPr>
-        <w:pStyle w:val="Heading1"/>
-      </w:pPr>
-      <w:r>
-        <w:t>Recovery Testing</w:t>
-      </w:r>
-    </w:p>
-    <w:p>
-      <w:r>
-        <w:t>Conduct scheduled disaster recovery exercises and document results, lessons learned and follow-up actions.</w:t>
-      </w:r>
-    </w:p>
-    <w:p>
-      <w:pPr>
-        <w:pStyle w:val="Heading1"/>
-      </w:pPr>
-      <w:r>
-        <w:t>Recovery Review</w:t>
-      </w:r>
-    </w:p>
-    <w:p>
-      <w:r>
-        <w:t>Perform a post-recovery review to identify improvements and update recovery procedures through controlled change.</w:t>
-      </w:r>
-    </w:p>
-    <w:p>
-      <w:pPr>
-        <w:pStyle w:val="Heading1"/>
-      </w:pPr>
-      <w:r>
-        <w:t>Related Documents</w:t>
-      </w:r>
-    </w:p>
-    <w:p>
-      <w:pPr>
-        <w:pStyle w:val="ListBullet"/>
-      </w:pPr>
-      <w:r>
-        <w:t>Engineering Policies</w:t>
-      </w:r>
-    </w:p>
-    <w:p>
-      <w:pPr>
-        <w:pStyle w:val="ListBullet"/>
-      </w:pPr>
-      <w:r>
-        <w:t>Operations Manual</w:t>
-      </w:r>
-    </w:p>
-    <w:p>
-      <w:pPr>
-        <w:pStyle w:val="ListBullet"/>
-      </w:pPr>
-      <w:r>
-        <w:t>Business Continuity Plan</w:t>
-      </w:r>
-    </w:p>
-    <w:p>
-      <w:pPr>
-        <w:pStyle w:val="ListBullet"/>
-      </w:pPr>
-      <w:r>
-        <w:t>Risk Register</w:t>
-      </w:r>
-    </w:p>
-    <w:p>
-      <w:pPr>
-        <w:pStyle w:val="ListBullet"/>
-      </w:pPr>
-      <w:r>
-        <w:t>SPOF Register</w:t>
-      </w:r>
-    </w:p>
-    <w:p>
-      <w:pPr>
-        <w:pStyle w:val="ListBullet"/>
-      </w:pPr>
-      <w:r>
-        <w:t>Recovery Validation Register</w:t>
-      </w:r>
-    </w:p>
-    <w:p>
-      <w:pPr>
-        <w:pStyle w:val="Heading1"/>
-      </w:pPr>
-      <w:r>
-        <w:t>Appendices</w:t>
-      </w:r>
-    </w:p>
-    <w:p>
-      <w:r>
-        <w:t>None.</w:t>
+        <w:rPr>
+          <w:sz w:val="21"/>
+        </w:rPr>
+        <w:t>Controlled approval, versioning, review and distribution.</w:t>
       </w:r>
     </w:p>
     <w:sectPr>

</xml_diff>